<commit_message>
modify year in LATAM award ceremony
</commit_message>
<xml_diff>
--- a/public/docs/patricio-anabalon-resume.docx
+++ b/public/docs/patricio-anabalon-resume.docx
@@ -525,7 +525,7 @@
           <w:szCs w:val="22"/>
           <w:rtl w:val="0"/>
         </w:rPr>
-        <w:t xml:space="preserve">Recognised as LATAM Service Leader 2025 for cross-team contribution.</w:t>
+        <w:t xml:space="preserve">Recognised as LATAM Service Leader for cross-team contribution.</w:t>
       </w:r>
       <w:r>
         <w:rPr>
@@ -1032,26 +1032,26 @@
       <w:r>
         <w:rPr>
           <w:rFonts w:ascii="Roboto" w:cs="Roboto" w:eastAsia="Roboto" w:hAnsi="Roboto"/>
-          <w:b w:val="1"/>
-          <w:bCs w:val="1"/>
-          <w:sz w:val="24"/>
-          <w:szCs w:val="24"/>
-          <w:rtl w:val="0"/>
-        </w:rPr>
-        <w:t xml:space="preserve">(in parallel with Amicar)</w:t>
-      </w:r>
-      <w:r>
-        <w:rPr>
-          <w:rFonts w:ascii="Roboto" w:cs="Roboto" w:eastAsia="Roboto" w:hAnsi="Roboto"/>
-          <w:b w:val="1"/>
-          <w:bCs w:val="1"/>
           <w:i w:val="1"/>
           <w:iCs w:val="1"/>
           <w:sz w:val="24"/>
           <w:szCs w:val="24"/>
           <w:rtl w:val="0"/>
         </w:rPr>
-        <w:tab/>
+        <w:t xml:space="preserve">(in parallel with Amicar)</w:t>
+        <w:tab/>
+      </w:r>
+      <w:r>
+        <w:rPr>
+          <w:rFonts w:ascii="Roboto" w:cs="Roboto" w:eastAsia="Roboto" w:hAnsi="Roboto"/>
+          <w:b w:val="1"/>
+          <w:bCs w:val="1"/>
+          <w:i w:val="1"/>
+          <w:iCs w:val="1"/>
+          <w:sz w:val="24"/>
+          <w:szCs w:val="24"/>
+          <w:rtl w:val="0"/>
+        </w:rPr>
         <w:tab/>
         <w:tab/>
         <w:t xml:space="preserve">      </w:t>
@@ -2080,16 +2080,16 @@
           <w:szCs w:val="22"/>
           <w:rtl w:val="0"/>
         </w:rPr>
-        <w:t xml:space="preserve">LATAM Service Leader (LATAM, 2025) — </w:t>
-      </w:r>
-      <w:r>
-        <w:rPr>
-          <w:rFonts w:ascii="Roboto" w:cs="Roboto" w:eastAsia="Roboto" w:hAnsi="Roboto"/>
-          <w:sz w:val="22"/>
-          <w:szCs w:val="22"/>
-          <w:rtl w:val="0"/>
-        </w:rPr>
-        <w:t xml:space="preserve">Company-wide recognition for cross-team contribution aligned with LATAM's J.E.T.S. values.</w:t>
+        <w:t xml:space="preserve">LATAM Service Leader (LATAM, 2026) — </w:t>
+      </w:r>
+      <w:r>
+        <w:rPr>
+          <w:rFonts w:ascii="Roboto" w:cs="Roboto" w:eastAsia="Roboto" w:hAnsi="Roboto"/>
+          <w:sz w:val="22"/>
+          <w:szCs w:val="22"/>
+          <w:rtl w:val="0"/>
+        </w:rPr>
+        <w:t xml:space="preserve">Company-wide recognition for cross-team contribution aligned with Safety, Sustainability and LATAM's J.E.T.S. values.</w:t>
       </w:r>
     </w:p>
     <w:p>

</xml_diff>